<commit_message>
ACTUALIZACIONES: MEJORAS: se envia mail al candidato cuando sus datos quedaron incompletos, cuando empresa se registra se le da 5 creditos a las primeras 100 despues de la 101 se le da 3 creditos es decir descargas de H.V, ya despues debe pagar por cada descarga, se agrega boton de whastapp en profesionales y empresas para soporte, se mejora buscador semantico embedding y se consume de api gemmini por cada embedding de candidatos se cobra 0.0003 dolares casi nada es solo cuando crea perfil o edita y surge cambios de lo contrario no consume cobro de api, boton de recupetrar contraseña , paginacion del directorio 12 por cada pagina
</commit_message>
<xml_diff>
--- a/talent_app/Reglamento Agente Inteligente.docx
+++ b/talent_app/Reglamento Agente Inteligente.docx
@@ -1511,7 +1511,25 @@
           <w:szCs w:val="22"/>
           <w:shd w:val="clear" w:color="auto" w:fill="FFFFFF"/>
         </w:rPr>
-        <w:t xml:space="preserve"> se permitirá un (1) expositor dentro del stand y uno (1) frente al mismo, siempre que no obstruya la visibilidad de los stands vecinos.</w:t>
+        <w:t xml:space="preserve"> se permitirá un (1) expositor dentro del stand </w:t>
+      </w:r>
+      <w:r>
+        <w:rPr>
+          <w:rFonts w:ascii="Arial" w:hAnsi="Arial" w:cs="Arial"/>
+          <w:sz w:val="22"/>
+          <w:szCs w:val="22"/>
+          <w:shd w:val="clear" w:color="auto" w:fill="FFFFFF"/>
+        </w:rPr>
+        <w:t>para que</w:t>
+      </w:r>
+      <w:r>
+        <w:rPr>
+          <w:rFonts w:ascii="Arial" w:hAnsi="Arial" w:cs="Arial"/>
+          <w:sz w:val="22"/>
+          <w:szCs w:val="22"/>
+          <w:shd w:val="clear" w:color="auto" w:fill="FFFFFF"/>
+        </w:rPr>
+        <w:t xml:space="preserve"> no obstruya la visibilidad de los stands vecinos.</w:t>
       </w:r>
     </w:p>
     <w:p>
@@ -6881,7 +6899,7 @@
           <w:lang w:val="en-US" w:eastAsia="en-US" w:bidi="ar-SA"/>
         </w:rPr>
         <w:drawing>
-          <wp:anchor distT="0" distB="0" distL="114300" distR="114300" simplePos="0" relativeHeight="251657728" behindDoc="0" locked="0" layoutInCell="1" allowOverlap="1" wp14:anchorId="43083F03" wp14:editId="4EA67E6E">
+          <wp:anchor distT="0" distB="0" distL="114300" distR="114300" simplePos="0" relativeHeight="251657728" behindDoc="0" locked="0" layoutInCell="1" allowOverlap="1" wp14:anchorId="43083F03" wp14:editId="1232F2DA">
             <wp:simplePos x="0" y="0"/>
             <wp:positionH relativeFrom="column">
               <wp:posOffset>4342130</wp:posOffset>

</xml_diff>